<commit_message>
Rework strategy around portfolio research interests; update CV
Co-Authored-By: Claude Sonnet 5.5 <noreply@anthropic.com>
Claude-Session: https://claude.ai/code/session_01Kmg6whRyJsqzah4pkXAxxY
</commit_message>
<xml_diff>
--- a/Adedamola_Adetola_CV_Canada_Graduate.docx
+++ b/Adedamola_Adetola_CV_Canada_Graduate.docx
@@ -32,7 +32,7 @@
           <w:sz w:val="21"/>
           <w:szCs w:val="21"/>
         </w:rPr>
-        <w:t xml:space="preserve">Mechanical Engineer  |  UAV Systems &amp; Fault Diagnostics  |  Design &amp; Manufacturing</w:t>
+        <w:t xml:space="preserve">Mechanical Engineer  |  UAV Design &amp; Diagnostics  |  Lightweight Structures  |  Manufacturing</w:t>
       </w:r>
     </w:p>
     <w:p>
@@ -91,7 +91,7 @@
           <w:sz w:val="20"/>
           <w:szCs w:val="20"/>
         </w:rPr>
-        <w:t xml:space="preserve">First Class Honours mechanical engineering graduate with hands-on UAV maintenance, fault diagnosis, machining and design experience, seeking a thesis-based MASc in aerospace/mechanical engineering. Research interests: fault diagnosis and fault-tolerant control of multirotor UAVs, and design-for-manufacture of small UAV airframes.</w:t>
+        <w:t xml:space="preserve">First Class Honours mechanical engineering graduate with hands-on UAV maintenance, fault diagnosis, machining and design experience, seeking a thesis-based MASc in aerospace/mechanical engineering. Research interests: UAV design and performance, lightweight composite structures, generative design and topology optimization, and smart manufacturing. Also interested in fault diagnosis of multirotor UAVs.</w:t>
       </w:r>
     </w:p>
     <w:p>
@@ -851,7 +851,7 @@
           <w:sz w:val="20"/>
           <w:szCs w:val="20"/>
         </w:rPr>
-        <w:t xml:space="preserve"> Autodesk Inventor, Fusion 360, AutoCAD</w:t>
+        <w:t xml:space="preserve"> Autodesk Inventor, Fusion 360, AutoCAD; generative design (Autodesk event, 2023)</w:t>
       </w:r>
     </w:p>
     <w:p>
@@ -907,7 +907,7 @@
           <w:highlight w:val="yellow"/>
           <w:highlightCs w:val="yellow"/>
         </w:rPr>
-        <w:t xml:space="preserve">[add FEA / MATLAB / Python / flight-log tools you actually use]</w:t>
+        <w:t xml:space="preserve">[add FEA and topology-optimization tools you have used, plus MATLAB / Python / flight-log tools]</w:t>
       </w:r>
       <w:r>
         <w:rPr>
@@ -1006,7 +1006,7 @@
           <w:sz w:val="20"/>
           <w:szCs w:val="20"/>
         </w:rPr>
-        <w:t xml:space="preserve">Autodesk Authorized Academic Partner Event (2023)</w:t>
+        <w:t xml:space="preserve">Autodesk Authorized Academic Partner Event on generative design (2023)</w:t>
       </w:r>
     </w:p>
     <w:p>

</xml_diff>

<commit_message>
Rebuild Word deliverables natively so they validate and open cleanly
Co-Authored-By: Claude Sonnet 5.5 <noreply@anthropic.com>
Claude-Session: https://claude.ai/code/session_01Kmg6whRyJsqzah4pkXAxxY
</commit_message>
<xml_diff>
--- a/Adedamola_Adetola_CV_Canada_Graduate.docx
+++ b/Adedamola_Adetola_CV_Canada_Graduate.docx
@@ -187,8 +187,7 @@
           <w:rFonts w:ascii="Calibri" w:cs="Calibri" w:eastAsia="Calibri" w:hAnsi="Calibri"/>
           <w:sz w:val="20"/>
           <w:szCs w:val="20"/>
-          <w:highlight w:val="yellow"/>
-          <w:highlightCs w:val="yellow"/>
+          <w:shd w:fill="FFF2A8" w:color="auto" w:val="clear"/>
         </w:rPr>
         <w:t xml:space="preserve">[X.XX / 5.00, with WES/Canadian-scale conversion]</w:t>
       </w:r>
@@ -205,8 +204,7 @@
           <w:rFonts w:ascii="Calibri" w:cs="Calibri" w:eastAsia="Calibri" w:hAnsi="Calibri"/>
           <w:sz w:val="20"/>
           <w:szCs w:val="20"/>
-          <w:highlight w:val="yellow"/>
-          <w:highlightCs w:val="yellow"/>
+          <w:shd w:fill="FFF2A8" w:color="auto" w:val="clear"/>
         </w:rPr>
         <w:t xml:space="preserve">[if known]</w:t>
       </w:r>
@@ -233,8 +231,7 @@
           <w:rFonts w:ascii="Calibri" w:cs="Calibri" w:eastAsia="Calibri" w:hAnsi="Calibri"/>
           <w:sz w:val="20"/>
           <w:szCs w:val="20"/>
-          <w:highlight w:val="yellow"/>
-          <w:highlightCs w:val="yellow"/>
+          <w:shd w:fill="FFF2A8" w:color="auto" w:val="clear"/>
         </w:rPr>
         <w:t xml:space="preserve">[title, supervisor, one-line result with a measured outcome]</w:t>
       </w:r>
@@ -261,8 +258,7 @@
           <w:rFonts w:ascii="Calibri" w:cs="Calibri" w:eastAsia="Calibri" w:hAnsi="Calibri"/>
           <w:sz w:val="20"/>
           <w:szCs w:val="20"/>
-          <w:highlight w:val="yellow"/>
-          <w:highlightCs w:val="yellow"/>
+          <w:shd w:fill="FFF2A8" w:color="auto" w:val="clear"/>
         </w:rPr>
         <w:t xml:space="preserve">[e.g. Control Systems, Fluid Mechanics, Machine Design, Manufacturing Processes, Mechanics of Materials]</w:t>
       </w:r>
@@ -318,8 +314,7 @@
           <w:iCs/>
           <w:sz w:val="20"/>
           <w:szCs w:val="20"/>
-          <w:highlight w:val="yellow"/>
-          <w:highlightCs w:val="yellow"/>
+          <w:shd w:fill="FFF2A8" w:color="auto" w:val="clear"/>
         </w:rPr>
         <w:t xml:space="preserve">[year]</w:t>
       </w:r>
@@ -364,8 +359,7 @@
           <w:rFonts w:ascii="Calibri" w:cs="Calibri" w:eastAsia="Calibri" w:hAnsi="Calibri"/>
           <w:sz w:val="20"/>
           <w:szCs w:val="20"/>
-          <w:highlight w:val="yellow"/>
-          <w:highlightCs w:val="yellow"/>
+          <w:shd w:fill="FFF2A8" w:color="auto" w:val="clear"/>
         </w:rPr>
         <w:t xml:space="preserve">[e.g. take-off mass, thrust-to-weight ratio, flight time, test outcomes]</w:t>
       </w:r>
@@ -402,8 +396,7 @@
           <w:iCs/>
           <w:sz w:val="20"/>
           <w:szCs w:val="20"/>
-          <w:highlight w:val="yellow"/>
-          <w:highlightCs w:val="yellow"/>
+          <w:shd w:fill="FFF2A8" w:color="auto" w:val="clear"/>
         </w:rPr>
         <w:t xml:space="preserve">[year]</w:t>
       </w:r>
@@ -448,8 +441,7 @@
           <w:rFonts w:ascii="Calibri" w:cs="Calibri" w:eastAsia="Calibri" w:hAnsi="Calibri"/>
           <w:sz w:val="20"/>
           <w:szCs w:val="20"/>
-          <w:highlight w:val="yellow"/>
-          <w:highlightCs w:val="yellow"/>
+          <w:shd w:fill="FFF2A8" w:color="auto" w:val="clear"/>
         </w:rPr>
         <w:t xml:space="preserve">[e.g. throughput, power rating, cost, test outcomes]</w:t>
       </w:r>
@@ -585,8 +577,7 @@
           <w:rFonts w:ascii="Calibri" w:cs="Calibri" w:eastAsia="Calibri" w:hAnsi="Calibri"/>
           <w:sz w:val="20"/>
           <w:szCs w:val="20"/>
-          <w:highlight w:val="yellow"/>
-          <w:highlightCs w:val="yellow"/>
+          <w:shd w:fill="FFF2A8" w:color="auto" w:val="clear"/>
         </w:rPr>
         <w:t xml:space="preserve">[number of airframes serviced, most common fault types, downtime reduced, if you have the figures]</w:t>
       </w:r>
@@ -904,8 +895,7 @@
           <w:rFonts w:ascii="Calibri" w:cs="Calibri" w:eastAsia="Calibri" w:hAnsi="Calibri"/>
           <w:sz w:val="20"/>
           <w:szCs w:val="20"/>
-          <w:highlight w:val="yellow"/>
-          <w:highlightCs w:val="yellow"/>
+          <w:shd w:fill="FFF2A8" w:color="auto" w:val="clear"/>
         </w:rPr>
         <w:t xml:space="preserve">[add FEA and topology-optimization tools you have used, plus MATLAB / Python / flight-log tools]</w:t>
       </w:r>
@@ -1031,8 +1021,7 @@
           <w:rFonts w:ascii="Calibri" w:cs="Calibri" w:eastAsia="Calibri" w:hAnsi="Calibri"/>
           <w:sz w:val="20"/>
           <w:szCs w:val="20"/>
-          <w:highlight w:val="yellow"/>
-          <w:highlightCs w:val="yellow"/>
+          <w:shd w:fill="FFF2A8" w:color="auto" w:val="clear"/>
         </w:rPr>
         <w:t xml:space="preserve">[Transport Canada RPAS Advanced Operations certificate, if you pursue it]</w:t>
       </w:r>
@@ -1088,8 +1077,7 @@
           <w:iCs/>
           <w:sz w:val="20"/>
           <w:szCs w:val="20"/>
-          <w:highlight w:val="yellow"/>
-          <w:highlightCs w:val="yellow"/>
+          <w:shd w:fill="FFF2A8" w:color="auto" w:val="clear"/>
         </w:rPr>
         <w:t xml:space="preserve">[dates]</w:t>
       </w:r>
@@ -1140,8 +1128,7 @@
           <w:rFonts w:ascii="Calibri" w:cs="Calibri" w:eastAsia="Calibri" w:hAnsi="Calibri"/>
           <w:sz w:val="20"/>
           <w:szCs w:val="20"/>
-          <w:highlight w:val="yellow"/>
-          <w:highlightCs w:val="yellow"/>
+          <w:shd w:fill="FFF2A8" w:color="auto" w:val="clear"/>
         </w:rPr>
         <w:t xml:space="preserve">[Two academic referees (final-year supervisor, head of department) and one industry referee (Aerotech supervisor) with titles and emails]</w:t>
       </w:r>

</xml_diff>